<commit_message>
Update author contact info
- README: use personal email for Prafful Gupta; add missing emails/
  ORCID for Neelam Rawat and Mohd. Aatir; add Dr. Prashant Agrawal
  (Associate Professor) as an author.
- Paper draft (code_smell_IEEE_authors_v2.docx): same additions to the
  author block.
</commit_message>
<xml_diff>
--- a/code_smell_IEEE_authors_v2.docx
+++ b/code_smell_IEEE_authors_v2.docx
@@ -69,6 +69,20 @@
         <w:br/>
         <w:t>Ghaziabad, Delhi-NCR, Uttar Pradesh, India</w:t>
       </w:r>
+      <w:r>
+        <w:rPr>
+          <w:sz w:val="18"/>
+        </w:rPr>
+        <w:br/>
+        <w:t>neelam.rawat@kiet.edu</w:t>
+      </w:r>
+      <w:r>
+        <w:rPr>
+          <w:sz w:val="18"/>
+        </w:rPr>
+        <w:br/>
+        <w:t>0000-0003-0759-6583</w:t>
+      </w:r>
     </w:p>
     <w:p>
       <w:pPr>
@@ -250,6 +264,13 @@
         <w:br/>
         <w:t>Ghaziabad, Delhi-NCR, Uttar Pradesh, India</w:t>
       </w:r>
+      <w:r>
+        <w:rPr>
+          <w:sz w:val="18"/>
+        </w:rPr>
+        <w:br/>
+        <w:t>mohdaatir01@gmail.com</w:t>
+      </w:r>
     </w:p>
     <w:p>
       <w:pPr>
@@ -309,6 +330,59 @@
         </w:rPr>
         <w:br/>
         <w:t>0000-0002-6885-7579</w:t>
+      </w:r>
+    </w:p>
+    <w:p>
+      <w:pPr>
+        <w:pStyle w:val="Author"/>
+      </w:pPr>
+      <w:r>
+        <w:rPr>
+          <w:sz w:val="18"/>
+        </w:rPr>
+        <w:t>Dr. Prashant Agrawal</w:t>
+      </w:r>
+      <w:r>
+        <w:rPr>
+          <w:sz w:val="18"/>
+        </w:rPr>
+        <w:br/>
+        <w:t>Associate Professor</w:t>
+      </w:r>
+      <w:r>
+        <w:rPr>
+          <w:sz w:val="18"/>
+        </w:rPr>
+        <w:br/>
+        <w:t>Department of Computer Applications</w:t>
+      </w:r>
+      <w:r>
+        <w:rPr>
+          <w:sz w:val="18"/>
+        </w:rPr>
+        <w:br/>
+        <w:t>Krishna Institute of Engineering &amp; Technology (KIET)</w:t>
+      </w:r>
+      <w:r>
+        <w:rPr>
+          <w:sz w:val="18"/>
+        </w:rPr>
+        <w:br/>
+        <w:t>Ghaziabad, Delhi-NCR, Uttar Pradesh, India</w:t>
+      </w:r>
+      <w:r>
+        <w:rPr>
+          <w:sz w:val="18"/>
+        </w:rPr>
+        <w:br/>
+        <w:t>prashant.agraw@gmail.com</w:t>
+      </w:r>
+      <w:r>
+        <w:rPr>
+          <w:sz w:val="18"/>
+        </w:rPr>
+        <w:br/>
+        <w:t>0000-0002-7890-024X</w:t>
       </w:r>
     </w:p>
     <w:p>

</xml_diff>

<commit_message>
Fix author block layout to a symmetric 3-over-3 grid
Row 2 (Mohd. Aatir / Shweta Singh / Dr. Prashant Agrawal) was in a
2-column section while row 1 uses 3, so Agrawal stacked under Shweta
instead of getting his own column. Changed row 2's section to 3 equal
columns (matching row 1) and added the same column-break run before
Agrawal's paragraph that Shweta's already has.
</commit_message>
<xml_diff>
--- a/code_smell_IEEE_authors_v2.docx
+++ b/code_smell_IEEE_authors_v2.docx
@@ -337,6 +337,9 @@
         <w:pStyle w:val="Author"/>
       </w:pPr>
       <w:r>
+        <w:br w:type="column"/>
+      </w:r>
+      <w:r>
         <w:rPr>
           <w:sz w:val="18"/>
         </w:rPr>
@@ -391,7 +394,7 @@
           <w:type w:val="continuous"/>
           <w:pgSz w:w="11906" w:h="16838"/>
           <w:pgMar w:top="777" w:right="893" w:bottom="1440" w:left="893" w:header="720" w:footer="720" w:gutter="0"/>
-          <w:cols w:num="2" w:space="200"/>
+          <w:cols w:num="3" w:space="200"/>
           <w:formProt w:val="0"/>
           <w:titlePg/>
           <w:docGrid w:linePitch="360" w:charSpace="8192"/>

</xml_diff>

<commit_message>
Fix vertical misalignment in author block
Neelam Rawat and Mohd. Aatir had beforeAutospacing=1 (Word's automatic
~1-line paragraph spacing), and the newly-added Dr. Prashant Agrawal
paragraph had no spacing override at all, while Prafful Gupta, Prashant
Kumar Singh, and Shweta Singh all had explicit zero before/after
spacing. That's exactly why 3 of the 6 authors' names started one line
lower than their row-mates. Set explicit before=0/after=0 spacing on
all three to match.
</commit_message>
<xml_diff>
--- a/code_smell_IEEE_authors_v2.docx
+++ b/code_smell_IEEE_authors_v2.docx
@@ -32,7 +32,7 @@
     <w:p>
       <w:pPr>
         <w:pStyle w:val="Author"/>
-        <w:spacing w:beforeAutospacing="1"/>
+        <w:spacing w:before="0" w:after="0"/>
         <w:rPr>
           <w:sz w:val="18"/>
           <w:szCs w:val="18"/>
@@ -227,7 +227,7 @@
     <w:p>
       <w:pPr>
         <w:pStyle w:val="Author"/>
-        <w:spacing w:beforeAutospacing="1"/>
+        <w:spacing w:before="0" w:after="0"/>
         <w:rPr>
           <w:sz w:val="18"/>
           <w:szCs w:val="18"/>
@@ -335,6 +335,7 @@
     <w:p>
       <w:pPr>
         <w:pStyle w:val="Author"/>
+        <w:spacing w:before="0" w:after="0"/>
       </w:pPr>
       <w:r>
         <w:br w:type="column"/>

</xml_diff>